<commit_message>
fix: update dosen pembimbing ke Dr. Fredella Colline di DOCX dan recompile PDF
</commit_message>
<xml_diff>
--- a/01_Naskah_Utama/Proposal_Arthur_PokemonTCG.docx
+++ b/01_Naskah_Utama/Proposal_Arthur_PokemonTCG.docx
@@ -1180,7 +1180,7 @@
                 <w:b/>
                 <w:bCs/>
               </w:rPr>
-              <w:t>(Dr. Diana Frederica, S.E., M.Ak., CFP®., CHCP-A)</w:t>
+              <w:t>(Dr. Fredella Colline, S.E., M.M., CFP®, PFM, CHCP-A)</w:t>
             </w:r>
           </w:p>
           <w:p>
@@ -1189,7 +1189,7 @@
               <w:jc w:val="left"/>
             </w:pPr>
             <w:r>
-              <w:t>NIDN: 0315088201</w:t>
+              <w:t>NIDN: [NIDN_DOSEN]</w:t>
             </w:r>
           </w:p>
         </w:tc>
@@ -1713,7 +1713,7 @@
                 <w:b/>
                 <w:bCs/>
               </w:rPr>
-              <w:t>Dr. Diana Frederica, S.E., M.Ak., CFP®., CHCP-A</w:t>
+              <w:t>Dr. Fredella Colline, S.E., M.M., CFP®, PFM, CHCP-A</w:t>
             </w:r>
           </w:p>
         </w:tc>
@@ -1799,18 +1799,15 @@
         <w:ind w:left="500" w:hanging="500"/>
       </w:pPr>
       <w:r>
-        <w:t xml:space="preserve">1. </w:t>
+        <w:t>1. Dr. Fredella Colline, S.E., M.M., CFP®, PFM, CHCP-A, selaku Dosen Pembimbing Skripsi, yang telah dengan luar biasa sabar, teliti, kritis, dan penuh dedikasi meluangkan waktu serta mencurahkan tenaga dan pikiran dalam membimbing, mengarahkan, dan menyempurnakan naskah proposal ini sejak tahap awal perumusan gagasan hingga penyusunan naskah komprehensif.</w:t>
       </w:r>
       <w:r>
         <w:rPr>
           <w:b/>
           <w:bCs/>
         </w:rPr>
-        <w:t>Dr. Diana Frederica, S.E., M.Ak., CFP®., CHCP-A</w:t>
-      </w:r>
-      <w:r>
-        <w:t>, selaku Dekan Fakultas Ekonomi dan Bisnis UKRIDA sekaligus Dosen Pembimbing Skripsi, yang telah dengan luar biasa sabar, teliti, kritis, dan penuh dedikasi meluangkan waktu serta mencurahkan tenaga dan pikiran dalam membimbing, mengarahkan, dan menyempurnakan naskah proposal ini sejak tahap awal perumusan gagasan hingga penyusunan naskah komprehensif.</w:t>
-      </w:r>
+      </w:r>
+      <w:r/>
     </w:p>
     <w:p>
       <w:pPr>
@@ -2062,7 +2059,7 @@
           <w:sz w:val="20"/>
           <w:szCs w:val="20"/>
         </w:rPr>
-        <w:t>Dosen Pembimbing: Dr. Diana Frederica, S.E., M.Ak., CFP®., CHCP-A</w:t>
+        <w:t>Dosen Pembimbing: Dr. Fredella Colline, S.E., M.M., CFP®, PFM, CHCP-A</w:t>
       </w:r>
     </w:p>
     <w:p>
@@ -2500,7 +2497,7 @@
           <w:sz w:val="20"/>
           <w:szCs w:val="20"/>
         </w:rPr>
-        <w:t>Thesis Advisor: Dr. Diana Frederica, S.E., M.Ak., CFP®., CHCP-A</w:t>
+        <w:t>Thesis Advisor: Dr. Fredella Colline, S.E., M.M., CFP®, PFM, CHCP-A</w:t>
       </w:r>
     </w:p>
     <w:p>
@@ -2695,7 +2692,7 @@
                 <w:sz w:val="22"/>
                 <w:szCs w:val="22"/>
               </w:rPr>
-              <w:t>(Dr. Diana Frederica, S.E., M.Ak., CFP®., CHCP-A)</w:t>
+              <w:t>(Dr. Fredella Colline, S.E., M.M., CFP®, PFM, CHCP-A)</w:t>
             </w:r>
           </w:p>
           <w:p>
@@ -2708,7 +2705,7 @@
                 <w:sz w:val="22"/>
                 <w:szCs w:val="22"/>
               </w:rPr>
-              <w:t>NIDN: 0315088201</w:t>
+              <w:t>NIDN: [NIDN_DOSEN]</w:t>
             </w:r>
           </w:p>
         </w:tc>

</xml_diff>

<commit_message>
fix(docx): surgical patch preserving 100% native Word XML structure & OpenXML compatibility
</commit_message>
<xml_diff>
--- a/01_Naskah_Utama/Proposal_Arthur_PokemonTCG.docx
+++ b/01_Naskah_Utama/Proposal_Arthur_PokemonTCG.docx
@@ -1799,15 +1799,18 @@
         <w:ind w:left="500" w:hanging="500"/>
       </w:pPr>
       <w:r>
-        <w:t>1. Dr. Fredella Colline, S.E., M.M., CFP®, PFM, CHCP-A, selaku Dosen Pembimbing Skripsi, yang telah dengan luar biasa sabar, teliti, kritis, dan penuh dedikasi meluangkan waktu serta mencurahkan tenaga dan pikiran dalam membimbing, mengarahkan, dan menyempurnakan naskah proposal ini sejak tahap awal perumusan gagasan hingga penyusunan naskah komprehensif.</w:t>
+        <w:t xml:space="preserve">1. </w:t>
       </w:r>
       <w:r>
         <w:rPr>
           <w:b/>
           <w:bCs/>
         </w:rPr>
-      </w:r>
-      <w:r/>
+        <w:t>Dr. Fredella Colline, S.E., M.M., CFP®, PFM, CHCP-A</w:t>
+      </w:r>
+      <w:r>
+        <w:t>, selaku Dosen Pembimbing Skripsi, yang telah dengan luar biasa sabar, teliti, kritis, dan penuh dedikasi meluangkan waktu serta mencurahkan tenaga dan pikiran dalam membimbing, mengarahkan, dan menyempurnakan naskah proposal ini sejak tahap awal perumusan gagasan hingga penyusunan naskah komprehensif.</w:t>
+      </w:r>
     </w:p>
     <w:p>
       <w:pPr>

</xml_diff>